<commit_message>
feat:fix and document SlotMachine, update UML models
</commit_message>
<xml_diff>
--- a/docs/Ciclo 1/Retrospectiva.docx
+++ b/docs/Ciclo 1/Retrospectiva.docx
@@ -1,6 +1,6 @@
 
 <file path=word/document.xml><?xml version="1.0" encoding="utf-8"?>
-<w:document xmlns:wpc="http://schemas.microsoft.com/office/word/2010/wordprocessingCanvas" xmlns:cx="http://schemas.microsoft.com/office/drawing/2014/chartex" xmlns:cx1="http://schemas.microsoft.com/office/drawing/2015/9/8/chartex" xmlns:cx2="http://schemas.microsoft.com/office/drawing/2015/10/21/chartex" xmlns:cx3="http://schemas.microsoft.com/office/drawing/2016/5/9/chartex" xmlns:cx4="http://schemas.microsoft.com/office/drawing/2016/5/10/chartex" xmlns:cx5="http://schemas.microsoft.com/office/drawing/2016/5/11/chartex" xmlns:cx6="http://schemas.microsoft.com/office/drawing/2016/5/12/chartex" xmlns:cx7="http://schemas.microsoft.com/office/drawing/2016/5/13/chartex" xmlns:cx8="http://schemas.microsoft.com/office/drawing/2016/5/14/chartex" xmlns:mc="http://schemas.openxmlformats.org/markup-compatibility/2006" xmlns:aink="http://schemas.microsoft.com/office/drawing/2016/ink" xmlns:am3d="http://schemas.microsoft.com/office/drawing/2017/model3d" xmlns:o="urn:schemas-microsoft-com:office:office" xmlns:r="http://schemas.openxmlformats.org/officeDocument/2006/relationships" xmlns:m="http://schemas.openxmlformats.org/officeDocument/2006/math" xmlns:v="urn:schemas-microsoft-com:vml" xmlns:wp14="http://schemas.microsoft.com/office/word/2010/wordprocessingDrawing" xmlns:wp="http://schemas.openxmlformats.org/drawingml/2006/wordprocessingDrawing" xmlns:w10="urn:schemas-microsoft-com:office:word" xmlns:w="http://schemas.openxmlformats.org/wordprocessingml/2006/main" xmlns:w14="http://schemas.microsoft.com/office/word/2010/wordml" xmlns:w15="http://schemas.microsoft.com/office/word/2012/wordml" xmlns:w16cex="http://schemas.microsoft.com/office/word/2018/wordml/cex" xmlns:w16cid="http://schemas.microsoft.com/office/word/2016/wordml/cid" xmlns:w16="http://schemas.microsoft.com/office/word/2018/wordml" xmlns:w16sdtdh="http://schemas.microsoft.com/office/word/2020/wordml/sdtdatahash" xmlns:w16se="http://schemas.microsoft.com/office/word/2015/wordml/symex" xmlns:wpg="http://schemas.microsoft.com/office/word/2010/wordprocessingGroup" xmlns:wpi="http://schemas.microsoft.com/office/word/2010/wordprocessingInk" xmlns:wne="http://schemas.microsoft.com/office/word/2006/wordml" xmlns:wps="http://schemas.microsoft.com/office/word/2010/wordprocessingShape" mc:Ignorable="w14 w15 w16se w16cid w16 w16cex w16sdtdh wp14">
+<w:document xmlns:wpc="http://schemas.microsoft.com/office/word/2010/wordprocessingCanvas" xmlns:cx="http://schemas.microsoft.com/office/drawing/2014/chartex" xmlns:cx1="http://schemas.microsoft.com/office/drawing/2015/9/8/chartex" xmlns:cx2="http://schemas.microsoft.com/office/drawing/2015/10/21/chartex" xmlns:cx3="http://schemas.microsoft.com/office/drawing/2016/5/9/chartex" xmlns:cx4="http://schemas.microsoft.com/office/drawing/2016/5/10/chartex" xmlns:cx5="http://schemas.microsoft.com/office/drawing/2016/5/11/chartex" xmlns:cx6="http://schemas.microsoft.com/office/drawing/2016/5/12/chartex" xmlns:cx7="http://schemas.microsoft.com/office/drawing/2016/5/13/chartex" xmlns:cx8="http://schemas.microsoft.com/office/drawing/2016/5/14/chartex" xmlns:mc="http://schemas.openxmlformats.org/markup-compatibility/2006" xmlns:aink="http://schemas.microsoft.com/office/drawing/2016/ink" xmlns:am3d="http://schemas.microsoft.com/office/drawing/2017/model3d" xmlns:o="urn:schemas-microsoft-com:office:office" xmlns:oel="http://schemas.microsoft.com/office/2019/extlst" xmlns:r="http://schemas.openxmlformats.org/officeDocument/2006/relationships" xmlns:m="http://schemas.openxmlformats.org/officeDocument/2006/math" xmlns:v="urn:schemas-microsoft-com:vml" xmlns:wp14="http://schemas.microsoft.com/office/word/2010/wordprocessingDrawing" xmlns:wp="http://schemas.openxmlformats.org/drawingml/2006/wordprocessingDrawing" xmlns:w10="urn:schemas-microsoft-com:office:word" xmlns:w="http://schemas.openxmlformats.org/wordprocessingml/2006/main" xmlns:w14="http://schemas.microsoft.com/office/word/2010/wordml" xmlns:w15="http://schemas.microsoft.com/office/word/2012/wordml" xmlns:w16cei="http://schemas.microsoft.com/office/word/2026/wordml/cei" xmlns:w16cex="http://schemas.microsoft.com/office/word/2018/wordml/cex" xmlns:w16cid="http://schemas.microsoft.com/office/word/2016/wordml/cid" xmlns:w16="http://schemas.microsoft.com/office/word/2018/wordml" xmlns:w16du="http://schemas.microsoft.com/office/word/2023/wordml/word16du" xmlns:w16sdtdh="http://schemas.microsoft.com/office/word/2020/wordml/sdtdatahash" xmlns:w16sdtfl="http://schemas.microsoft.com/office/word/2024/wordml/sdtformatlock" xmlns:w16se="http://schemas.microsoft.com/office/word/2015/wordml/symex" xmlns:wpg="http://schemas.microsoft.com/office/word/2010/wordprocessingGroup" xmlns:wpi="http://schemas.microsoft.com/office/word/2010/wordprocessingInk" xmlns:wne="http://schemas.microsoft.com/office/word/2006/wordml" xmlns:wps="http://schemas.microsoft.com/office/word/2010/wordprocessingShape" mc:Ignorable="w14 w15 w16se w16cid w16 w16cex w16sdtdh w16sdtfl w16du wp14">
   <w:body>
     <w:p>
       <w:pPr>
@@ -207,6 +207,7 @@
         <w:t xml:space="preserve">(pos), </w:t>
       </w:r>
       <w:proofErr w:type="spellStart"/>
+      <w:proofErr w:type="gramStart"/>
       <w:r>
         <w:rPr>
           <w:rFonts w:ascii="Arial" w:hAnsi="Arial" w:cs="Arial"/>
@@ -222,7 +223,16 @@
           <w:color w:val="0070C0"/>
           <w:lang w:val="en-US"/>
         </w:rPr>
-        <w:t>(),</w:t>
+        <w:t>(</w:t>
+      </w:r>
+      <w:proofErr w:type="gramEnd"/>
+      <w:r>
+        <w:rPr>
+          <w:rFonts w:ascii="Arial" w:hAnsi="Arial" w:cs="Arial"/>
+          <w:color w:val="0070C0"/>
+          <w:lang w:val="en-US"/>
+        </w:rPr>
+        <w:t>),</w:t>
       </w:r>
       <w:r>
         <w:rPr>
@@ -233,6 +243,7 @@
         <w:t xml:space="preserve"> </w:t>
       </w:r>
       <w:proofErr w:type="spellStart"/>
+      <w:proofErr w:type="gramStart"/>
       <w:r>
         <w:rPr>
           <w:rFonts w:ascii="Arial" w:hAnsi="Arial" w:cs="Arial"/>
@@ -248,7 +259,16 @@
           <w:color w:val="0070C0"/>
           <w:lang w:val="en-US"/>
         </w:rPr>
-        <w:t>()</w:t>
+        <w:t>(</w:t>
+      </w:r>
+      <w:proofErr w:type="gramEnd"/>
+      <w:r>
+        <w:rPr>
+          <w:rFonts w:ascii="Arial" w:hAnsi="Arial" w:cs="Arial"/>
+          <w:color w:val="0070C0"/>
+          <w:lang w:val="en-US"/>
+        </w:rPr>
+        <w:t>)</w:t>
       </w:r>
     </w:p>
     <w:p>
@@ -629,13 +649,23 @@
         </w:rPr>
         <w:t xml:space="preserve"> </w:t>
       </w:r>
-      <w:r>
-        <w:rPr>
-          <w:rFonts w:ascii="Arial" w:hAnsi="Arial" w:cs="Arial"/>
-          <w:color w:val="0070C0"/>
-          <w:lang w:val="en-US"/>
-        </w:rPr>
-        <w:t>spin(),</w:t>
+      <w:proofErr w:type="gramStart"/>
+      <w:r>
+        <w:rPr>
+          <w:rFonts w:ascii="Arial" w:hAnsi="Arial" w:cs="Arial"/>
+          <w:color w:val="0070C0"/>
+          <w:lang w:val="en-US"/>
+        </w:rPr>
+        <w:t>spin(</w:t>
+      </w:r>
+      <w:proofErr w:type="gramEnd"/>
+      <w:r>
+        <w:rPr>
+          <w:rFonts w:ascii="Arial" w:hAnsi="Arial" w:cs="Arial"/>
+          <w:color w:val="0070C0"/>
+          <w:lang w:val="en-US"/>
+        </w:rPr>
+        <w:t>),</w:t>
       </w:r>
       <w:r>
         <w:rPr>
@@ -646,6 +676,7 @@
         <w:t xml:space="preserve"> </w:t>
       </w:r>
       <w:proofErr w:type="spellStart"/>
+      <w:proofErr w:type="gramStart"/>
       <w:r>
         <w:rPr>
           <w:rFonts w:ascii="Arial" w:hAnsi="Arial" w:cs="Arial"/>
@@ -661,7 +692,34 @@
           <w:color w:val="0070C0"/>
           <w:lang w:val="en-US"/>
         </w:rPr>
-        <w:t>(Wheel, symbol), configuration(),</w:t>
+        <w:t>(</w:t>
+      </w:r>
+      <w:proofErr w:type="gramEnd"/>
+      <w:r>
+        <w:rPr>
+          <w:rFonts w:ascii="Arial" w:hAnsi="Arial" w:cs="Arial"/>
+          <w:color w:val="0070C0"/>
+          <w:lang w:val="en-US"/>
+        </w:rPr>
+        <w:t xml:space="preserve">Wheel, symbol), </w:t>
+      </w:r>
+      <w:proofErr w:type="gramStart"/>
+      <w:r>
+        <w:rPr>
+          <w:rFonts w:ascii="Arial" w:hAnsi="Arial" w:cs="Arial"/>
+          <w:color w:val="0070C0"/>
+          <w:lang w:val="en-US"/>
+        </w:rPr>
+        <w:t>configuration(</w:t>
+      </w:r>
+      <w:proofErr w:type="gramEnd"/>
+      <w:r>
+        <w:rPr>
+          <w:rFonts w:ascii="Arial" w:hAnsi="Arial" w:cs="Arial"/>
+          <w:color w:val="0070C0"/>
+          <w:lang w:val="en-US"/>
+        </w:rPr>
+        <w:t>),</w:t>
       </w:r>
       <w:r>
         <w:rPr>
@@ -672,6 +730,7 @@
         <w:t xml:space="preserve"> </w:t>
       </w:r>
       <w:proofErr w:type="spellStart"/>
+      <w:proofErr w:type="gramStart"/>
       <w:r>
         <w:rPr>
           <w:rFonts w:ascii="Arial" w:hAnsi="Arial" w:cs="Arial"/>
@@ -687,7 +746,16 @@
           <w:color w:val="0070C0"/>
           <w:lang w:val="en-US"/>
         </w:rPr>
-        <w:t>(),</w:t>
+        <w:t>(</w:t>
+      </w:r>
+      <w:proofErr w:type="gramEnd"/>
+      <w:r>
+        <w:rPr>
+          <w:rFonts w:ascii="Arial" w:hAnsi="Arial" w:cs="Arial"/>
+          <w:color w:val="0070C0"/>
+          <w:lang w:val="en-US"/>
+        </w:rPr>
+        <w:t>),</w:t>
       </w:r>
       <w:r>
         <w:rPr>
@@ -698,6 +766,7 @@
         <w:t xml:space="preserve"> </w:t>
       </w:r>
       <w:proofErr w:type="spellStart"/>
+      <w:proofErr w:type="gramStart"/>
       <w:r>
         <w:rPr>
           <w:rFonts w:ascii="Arial" w:hAnsi="Arial" w:cs="Arial"/>
@@ -713,7 +782,16 @@
           <w:color w:val="0070C0"/>
           <w:lang w:val="en-US"/>
         </w:rPr>
-        <w:t>()</w:t>
+        <w:t>(</w:t>
+      </w:r>
+      <w:proofErr w:type="gramEnd"/>
+      <w:r>
+        <w:rPr>
+          <w:rFonts w:ascii="Arial" w:hAnsi="Arial" w:cs="Arial"/>
+          <w:color w:val="0070C0"/>
+          <w:lang w:val="en-US"/>
+        </w:rPr>
+        <w:t>)</w:t>
       </w:r>
     </w:p>
     <w:p>
@@ -866,7 +944,15 @@
           <w:rFonts w:ascii="Arial" w:hAnsi="Arial" w:cs="Arial"/>
           <w:color w:val="0070C0"/>
         </w:rPr>
-        <w:t>(),</w:t>
+        <w:t>(</w:t>
+      </w:r>
+      <w:proofErr w:type="gramStart"/>
+      <w:r>
+        <w:rPr>
+          <w:rFonts w:ascii="Arial" w:hAnsi="Arial" w:cs="Arial"/>
+          <w:color w:val="0070C0"/>
+        </w:rPr>
+        <w:t>),</w:t>
       </w:r>
       <w:proofErr w:type="spellStart"/>
       <w:r>
@@ -877,6 +963,7 @@
         <w:t>exit</w:t>
       </w:r>
       <w:proofErr w:type="spellEnd"/>
+      <w:proofErr w:type="gramEnd"/>
       <w:r>
         <w:rPr>
           <w:rFonts w:ascii="Arial" w:hAnsi="Arial" w:cs="Arial"/>
@@ -1029,6 +1116,133 @@
           <w:color w:val="0070C0"/>
         </w:rPr>
         <w:t xml:space="preserve"> siendo esto lo último que se ejecutaría dentro del programa.</w:t>
+      </w:r>
+    </w:p>
+    <w:p>
+      <w:pPr>
+        <w:pStyle w:val="Prrafodelista"/>
+        <w:rPr>
+          <w:rFonts w:ascii="Arial" w:hAnsi="Arial" w:cs="Arial"/>
+          <w:color w:val="0070C0"/>
+        </w:rPr>
+      </w:pPr>
+    </w:p>
+    <w:p>
+      <w:pPr>
+        <w:pStyle w:val="Prrafodelista"/>
+        <w:rPr>
+          <w:rFonts w:ascii="Arial" w:hAnsi="Arial" w:cs="Arial"/>
+          <w:color w:val="0070C0"/>
+        </w:rPr>
+      </w:pPr>
+      <w:r>
+        <w:rPr>
+          <w:rFonts w:ascii="Arial" w:hAnsi="Arial" w:cs="Arial"/>
+          <w:color w:val="0070C0"/>
+        </w:rPr>
+        <w:t>METODOS AUXILIARES</w:t>
+      </w:r>
+    </w:p>
+    <w:p>
+      <w:pPr>
+        <w:pStyle w:val="Prrafodelista"/>
+        <w:numPr>
+          <w:ilvl w:val="0"/>
+          <w:numId w:val="2"/>
+        </w:numPr>
+        <w:rPr>
+          <w:rFonts w:ascii="Arial" w:hAnsi="Arial" w:cs="Arial"/>
+          <w:color w:val="0070C0"/>
+        </w:rPr>
+      </w:pPr>
+      <w:r>
+        <w:rPr>
+          <w:rFonts w:ascii="Arial" w:hAnsi="Arial" w:cs="Arial"/>
+          <w:color w:val="0070C0"/>
+        </w:rPr>
+        <w:t>ok(</w:t>
+      </w:r>
+      <w:proofErr w:type="gramStart"/>
+      <w:r>
+        <w:rPr>
+          <w:rFonts w:ascii="Arial" w:hAnsi="Arial" w:cs="Arial"/>
+          <w:color w:val="0070C0"/>
+        </w:rPr>
+        <w:t>),</w:t>
+      </w:r>
+      <w:proofErr w:type="spellStart"/>
+      <w:r>
+        <w:rPr>
+          <w:rFonts w:ascii="Arial" w:hAnsi="Arial" w:cs="Arial"/>
+          <w:color w:val="0070C0"/>
+        </w:rPr>
+        <w:t>adjustPosition</w:t>
+      </w:r>
+      <w:proofErr w:type="spellEnd"/>
+      <w:proofErr w:type="gramEnd"/>
+      <w:r>
+        <w:rPr>
+          <w:rFonts w:ascii="Arial" w:hAnsi="Arial" w:cs="Arial"/>
+          <w:color w:val="0070C0"/>
+        </w:rPr>
+        <w:t>(</w:t>
+      </w:r>
+      <w:proofErr w:type="gramStart"/>
+      <w:r>
+        <w:rPr>
+          <w:rFonts w:ascii="Arial" w:hAnsi="Arial" w:cs="Arial"/>
+          <w:color w:val="0070C0"/>
+        </w:rPr>
+        <w:t>),</w:t>
+      </w:r>
+      <w:proofErr w:type="spellStart"/>
+      <w:r>
+        <w:rPr>
+          <w:rFonts w:ascii="Arial" w:hAnsi="Arial" w:cs="Arial"/>
+          <w:color w:val="0070C0"/>
+        </w:rPr>
+        <w:t>updateBoardSize</w:t>
+      </w:r>
+      <w:proofErr w:type="spellEnd"/>
+      <w:proofErr w:type="gramEnd"/>
+      <w:r>
+        <w:rPr>
+          <w:rFonts w:ascii="Arial" w:hAnsi="Arial" w:cs="Arial"/>
+          <w:color w:val="0070C0"/>
+        </w:rPr>
+        <w:t>()</w:t>
+      </w:r>
+    </w:p>
+    <w:p>
+      <w:pPr>
+        <w:ind w:left="720"/>
+        <w:rPr>
+          <w:rFonts w:ascii="Arial" w:hAnsi="Arial" w:cs="Arial"/>
+          <w:color w:val="0070C0"/>
+        </w:rPr>
+      </w:pPr>
+      <w:r>
+        <w:rPr>
+          <w:rFonts w:ascii="Arial" w:hAnsi="Arial" w:cs="Arial"/>
+          <w:color w:val="0070C0"/>
+        </w:rPr>
+        <w:t xml:space="preserve">JUSTIFICACION: Estas clases son necesarias para reutilizar líneas de código que se usan en varios métodos de la clase </w:t>
+      </w:r>
+      <w:proofErr w:type="spellStart"/>
+      <w:r>
+        <w:rPr>
+          <w:rFonts w:ascii="Arial" w:hAnsi="Arial" w:cs="Arial"/>
+          <w:color w:val="0070C0"/>
+        </w:rPr>
+        <w:t>slotMachine</w:t>
+      </w:r>
+      <w:proofErr w:type="spellEnd"/>
+      <w:r>
+        <w:rPr>
+          <w:rFonts w:ascii="Arial" w:hAnsi="Arial" w:cs="Arial"/>
+          <w:color w:val="0070C0"/>
+        </w:rPr>
+        <w:t xml:space="preserve"> por lo que son necesarios para delegarles esos bloques de código y reutilizarlos cada vez que lo necesitemos.</w:t>
       </w:r>
     </w:p>
     <w:p>
@@ -1327,6 +1541,7 @@
         <w:ind w:left="709" w:hanging="709"/>
         <w:rPr>
           <w:rFonts w:ascii="Arial" w:hAnsi="Arial" w:cs="Arial"/>
+          <w:lang w:val="en-US"/>
         </w:rPr>
       </w:pPr>
       <w:r>
@@ -1369,7 +1584,27 @@
           <w:iCs/>
           <w:lang w:val="en-US"/>
         </w:rPr>
-        <w:t xml:space="preserve"> en Java</w:t>
+        <w:t xml:space="preserve"> </w:t>
+      </w:r>
+      <w:proofErr w:type="spellStart"/>
+      <w:r>
+        <w:rPr>
+          <w:rFonts w:ascii="Arial" w:hAnsi="Arial" w:cs="Arial"/>
+          <w:i/>
+          <w:iCs/>
+          <w:lang w:val="en-US"/>
+        </w:rPr>
+        <w:t>en</w:t>
+      </w:r>
+      <w:proofErr w:type="spellEnd"/>
+      <w:r>
+        <w:rPr>
+          <w:rFonts w:ascii="Arial" w:hAnsi="Arial" w:cs="Arial"/>
+          <w:i/>
+          <w:iCs/>
+          <w:lang w:val="en-US"/>
+        </w:rPr>
+        <w:t xml:space="preserve"> Java</w:t>
       </w:r>
       <w:r>
         <w:rPr>
@@ -1383,6 +1618,7 @@
           <w:rPr>
             <w:rStyle w:val="Hipervnculo"/>
             <w:rFonts w:ascii="Arial" w:eastAsiaTheme="majorEastAsia" w:hAnsi="Arial" w:cs="Arial"/>
+            <w:lang w:val="en-US"/>
           </w:rPr>
           <w:t>https://oregoom.com/java/jpanel/</w:t>
         </w:r>
@@ -1550,7 +1786,7 @@
 </file>
 
 <file path=word/numbering.xml><?xml version="1.0" encoding="utf-8"?>
-<w:numbering xmlns:wpc="http://schemas.microsoft.com/office/word/2010/wordprocessingCanvas" xmlns:cx="http://schemas.microsoft.com/office/drawing/2014/chartex" xmlns:cx1="http://schemas.microsoft.com/office/drawing/2015/9/8/chartex" xmlns:cx2="http://schemas.microsoft.com/office/drawing/2015/10/21/chartex" xmlns:cx3="http://schemas.microsoft.com/office/drawing/2016/5/9/chartex" xmlns:cx4="http://schemas.microsoft.com/office/drawing/2016/5/10/chartex" xmlns:cx5="http://schemas.microsoft.com/office/drawing/2016/5/11/chartex" xmlns:cx6="http://schemas.microsoft.com/office/drawing/2016/5/12/chartex" xmlns:cx7="http://schemas.microsoft.com/office/drawing/2016/5/13/chartex" xmlns:cx8="http://schemas.microsoft.com/office/drawing/2016/5/14/chartex" xmlns:mc="http://schemas.openxmlformats.org/markup-compatibility/2006" xmlns:aink="http://schemas.microsoft.com/office/drawing/2016/ink" xmlns:am3d="http://schemas.microsoft.com/office/drawing/2017/model3d" xmlns:o="urn:schemas-microsoft-com:office:office" xmlns:r="http://schemas.openxmlformats.org/officeDocument/2006/relationships" xmlns:m="http://schemas.openxmlformats.org/officeDocument/2006/math" xmlns:v="urn:schemas-microsoft-com:vml" xmlns:wp14="http://schemas.microsoft.com/office/word/2010/wordprocessingDrawing" xmlns:wp="http://schemas.openxmlformats.org/drawingml/2006/wordprocessingDrawing" xmlns:w10="urn:schemas-microsoft-com:office:word" xmlns:w="http://schemas.openxmlformats.org/wordprocessingml/2006/main" xmlns:w14="http://schemas.microsoft.com/office/word/2010/wordml" xmlns:w15="http://schemas.microsoft.com/office/word/2012/wordml" xmlns:w16cex="http://schemas.microsoft.com/office/word/2018/wordml/cex" xmlns:w16cid="http://schemas.microsoft.com/office/word/2016/wordml/cid" xmlns:w16="http://schemas.microsoft.com/office/word/2018/wordml" xmlns:w16sdtdh="http://schemas.microsoft.com/office/word/2020/wordml/sdtdatahash" xmlns:w16se="http://schemas.microsoft.com/office/word/2015/wordml/symex" xmlns:wpg="http://schemas.microsoft.com/office/word/2010/wordprocessingGroup" xmlns:wpi="http://schemas.microsoft.com/office/word/2010/wordprocessingInk" xmlns:wne="http://schemas.microsoft.com/office/word/2006/wordml" xmlns:wps="http://schemas.microsoft.com/office/word/2010/wordprocessingShape" mc:Ignorable="w14 w15 w16se w16cid w16 w16cex w16sdtdh wp14">
+<w:numbering xmlns:wpc="http://schemas.microsoft.com/office/word/2010/wordprocessingCanvas" xmlns:cx="http://schemas.microsoft.com/office/drawing/2014/chartex" xmlns:cx1="http://schemas.microsoft.com/office/drawing/2015/9/8/chartex" xmlns:cx2="http://schemas.microsoft.com/office/drawing/2015/10/21/chartex" xmlns:cx3="http://schemas.microsoft.com/office/drawing/2016/5/9/chartex" xmlns:cx4="http://schemas.microsoft.com/office/drawing/2016/5/10/chartex" xmlns:cx5="http://schemas.microsoft.com/office/drawing/2016/5/11/chartex" xmlns:cx6="http://schemas.microsoft.com/office/drawing/2016/5/12/chartex" xmlns:cx7="http://schemas.microsoft.com/office/drawing/2016/5/13/chartex" xmlns:cx8="http://schemas.microsoft.com/office/drawing/2016/5/14/chartex" xmlns:mc="http://schemas.openxmlformats.org/markup-compatibility/2006" xmlns:aink="http://schemas.microsoft.com/office/drawing/2016/ink" xmlns:am3d="http://schemas.microsoft.com/office/drawing/2017/model3d" xmlns:o="urn:schemas-microsoft-com:office:office" xmlns:oel="http://schemas.microsoft.com/office/2019/extlst" xmlns:r="http://schemas.openxmlformats.org/officeDocument/2006/relationships" xmlns:m="http://schemas.openxmlformats.org/officeDocument/2006/math" xmlns:v="urn:schemas-microsoft-com:vml" xmlns:wp14="http://schemas.microsoft.com/office/word/2010/wordprocessingDrawing" xmlns:wp="http://schemas.openxmlformats.org/drawingml/2006/wordprocessingDrawing" xmlns:w10="urn:schemas-microsoft-com:office:word" xmlns:w="http://schemas.openxmlformats.org/wordprocessingml/2006/main" xmlns:w14="http://schemas.microsoft.com/office/word/2010/wordml" xmlns:w15="http://schemas.microsoft.com/office/word/2012/wordml" xmlns:w16cei="http://schemas.microsoft.com/office/word/2026/wordml/cei" xmlns:w16cex="http://schemas.microsoft.com/office/word/2018/wordml/cex" xmlns:w16cid="http://schemas.microsoft.com/office/word/2016/wordml/cid" xmlns:w16="http://schemas.microsoft.com/office/word/2018/wordml" xmlns:w16du="http://schemas.microsoft.com/office/word/2023/wordml/word16du" xmlns:w16sdtdh="http://schemas.microsoft.com/office/word/2020/wordml/sdtdatahash" xmlns:w16sdtfl="http://schemas.microsoft.com/office/word/2024/wordml/sdtformatlock" xmlns:w16se="http://schemas.microsoft.com/office/word/2015/wordml/symex" xmlns:wpg="http://schemas.microsoft.com/office/word/2010/wordprocessingGroup" xmlns:wpi="http://schemas.microsoft.com/office/word/2010/wordprocessingInk" xmlns:wne="http://schemas.microsoft.com/office/word/2006/wordml" xmlns:wps="http://schemas.microsoft.com/office/word/2010/wordprocessingShape" mc:Ignorable="w14 w15 w16se w16cid w16 w16cex w16sdtdh w16sdtfl w16du wp14">
   <w:abstractNum w:abstractNumId="0" w15:restartNumberingAfterBreak="0">
     <w:nsid w:val="45767147"/>
     <w:multiLevelType w:val="hybridMultilevel"/>
@@ -1753,17 +1989,17 @@
       </w:rPr>
     </w:lvl>
   </w:abstractNum>
-  <w:num w:numId="1">
+  <w:num w:numId="1" w16cid:durableId="1262765877">
     <w:abstractNumId w:val="0"/>
   </w:num>
-  <w:num w:numId="2">
+  <w:num w:numId="2" w16cid:durableId="547227165">
     <w:abstractNumId w:val="1"/>
   </w:num>
 </w:numbering>
 </file>
 
 <file path=word/styles.xml><?xml version="1.0" encoding="utf-8"?>
-<w:styles xmlns:mc="http://schemas.openxmlformats.org/markup-compatibility/2006" xmlns:r="http://schemas.openxmlformats.org/officeDocument/2006/relationships" xmlns:w="http://schemas.openxmlformats.org/wordprocessingml/2006/main" xmlns:w14="http://schemas.microsoft.com/office/word/2010/wordml" xmlns:w15="http://schemas.microsoft.com/office/word/2012/wordml" xmlns:w16cex="http://schemas.microsoft.com/office/word/2018/wordml/cex" xmlns:w16cid="http://schemas.microsoft.com/office/word/2016/wordml/cid" xmlns:w16="http://schemas.microsoft.com/office/word/2018/wordml" xmlns:w16sdtdh="http://schemas.microsoft.com/office/word/2020/wordml/sdtdatahash" xmlns:w16se="http://schemas.microsoft.com/office/word/2015/wordml/symex" mc:Ignorable="w14 w15 w16se w16cid w16 w16cex w16sdtdh">
+<w:styles xmlns:mc="http://schemas.openxmlformats.org/markup-compatibility/2006" xmlns:r="http://schemas.openxmlformats.org/officeDocument/2006/relationships" xmlns:w="http://schemas.openxmlformats.org/wordprocessingml/2006/main" xmlns:w14="http://schemas.microsoft.com/office/word/2010/wordml" xmlns:w15="http://schemas.microsoft.com/office/word/2012/wordml" xmlns:w16cex="http://schemas.microsoft.com/office/word/2018/wordml/cex" xmlns:w16cid="http://schemas.microsoft.com/office/word/2016/wordml/cid" xmlns:w16="http://schemas.microsoft.com/office/word/2018/wordml" xmlns:w16du="http://schemas.microsoft.com/office/word/2023/wordml/word16du" xmlns:w16sdtdh="http://schemas.microsoft.com/office/word/2020/wordml/sdtdatahash" xmlns:w16sdtfl="http://schemas.microsoft.com/office/word/2024/wordml/sdtformatlock" xmlns:w16se="http://schemas.microsoft.com/office/word/2015/wordml/symex" mc:Ignorable="w14 w15 w16se w16cid w16 w16cex w16sdtdh w16sdtfl w16du">
   <w:docDefaults>
     <w:rPrDefault>
       <w:rPr>
@@ -2365,7 +2601,6 @@
   <w:style w:type="character" w:default="1" w:styleId="Fuentedeprrafopredeter">
     <w:name w:val="Default Paragraph Font"/>
     <w:uiPriority w:val="1"/>
-    <w:semiHidden/>
     <w:unhideWhenUsed/>
   </w:style>
   <w:style w:type="table" w:default="1" w:styleId="Tablanormal">

</xml_diff>

<commit_message>
feat: Complete the retrospective document
</commit_message>
<xml_diff>
--- a/docs/Ciclo 1/Retrospectiva.docx
+++ b/docs/Ciclo 1/Retrospectiva.docx
@@ -4,7 +4,11 @@
   <w:body>
     <w:p>
       <w:pPr>
-        <w:ind w:left="720" w:hanging="360"/>
+        <w:pStyle w:val="Prrafodelista"/>
+        <w:numPr>
+          <w:ilvl w:val="0"/>
+          <w:numId w:val="4"/>
+        </w:numPr>
         <w:rPr>
           <w:rFonts w:ascii="Arial" w:hAnsi="Arial" w:cs="Arial"/>
           <w:b/>
@@ -21,9 +25,16 @@
           <w:sz w:val="28"/>
           <w:szCs w:val="28"/>
         </w:rPr>
-        <w:t>RETROSPECTIVA</w:t>
-      </w:r>
-      <w:r>
+        <w:t>Oscar Poveda</w:t>
+      </w:r>
+    </w:p>
+    <w:p>
+      <w:pPr>
+        <w:pStyle w:val="Prrafodelista"/>
+        <w:numPr>
+          <w:ilvl w:val="0"/>
+          <w:numId w:val="4"/>
+        </w:numPr>
         <w:rPr>
           <w:rFonts w:ascii="Arial" w:hAnsi="Arial" w:cs="Arial"/>
           <w:b/>
@@ -31,8 +42,72 @@
           <w:sz w:val="28"/>
           <w:szCs w:val="28"/>
         </w:rPr>
+      </w:pPr>
+      <w:r>
+        <w:rPr>
+          <w:rFonts w:ascii="Arial" w:hAnsi="Arial" w:cs="Arial"/>
+          <w:b/>
+          <w:bCs/>
+          <w:sz w:val="28"/>
+          <w:szCs w:val="28"/>
+        </w:rPr>
+        <w:t>Elian Ibarra</w:t>
+      </w:r>
+    </w:p>
+    <w:p>
+      <w:pPr>
+        <w:ind w:left="720" w:hanging="360"/>
+        <w:rPr>
+          <w:rFonts w:ascii="Arial" w:hAnsi="Arial" w:cs="Arial"/>
+          <w:b/>
+          <w:bCs/>
+          <w:sz w:val="28"/>
+          <w:szCs w:val="28"/>
+          <w:u w:val="single"/>
+        </w:rPr>
+      </w:pPr>
+      <w:r>
+        <w:rPr>
+          <w:rFonts w:ascii="Arial" w:hAnsi="Arial" w:cs="Arial"/>
+          <w:b/>
+          <w:bCs/>
+          <w:sz w:val="28"/>
+          <w:szCs w:val="28"/>
+        </w:rPr>
+        <w:t>RETROSPECTIVA</w:t>
+      </w:r>
+      <w:r>
+        <w:rPr>
+          <w:rFonts w:ascii="Arial" w:hAnsi="Arial" w:cs="Arial"/>
+          <w:b/>
+          <w:bCs/>
+          <w:sz w:val="28"/>
+          <w:szCs w:val="28"/>
+        </w:rPr>
         <w:t xml:space="preserve"> CICLO 1</w:t>
       </w:r>
+      <w:r>
+        <w:rPr>
+          <w:rFonts w:ascii="Arial" w:hAnsi="Arial" w:cs="Arial"/>
+          <w:b/>
+          <w:bCs/>
+          <w:sz w:val="28"/>
+          <w:szCs w:val="28"/>
+        </w:rPr>
+        <w:t xml:space="preserve"> </w:t>
+      </w:r>
+      <w:proofErr w:type="spellStart"/>
+      <w:r>
+        <w:rPr>
+          <w:rFonts w:ascii="Arial" w:hAnsi="Arial" w:cs="Arial"/>
+          <w:b/>
+          <w:bCs/>
+          <w:sz w:val="28"/>
+          <w:szCs w:val="28"/>
+        </w:rPr>
+        <w:t>SlotMachine</w:t>
+      </w:r>
+      <w:proofErr w:type="spellEnd"/>
     </w:p>
     <w:p>
       <w:pPr>
@@ -997,6 +1072,7 @@
           <w:bCs/>
           <w:color w:val="0070C0"/>
         </w:rPr>
+        <w:lastRenderedPageBreak/>
         <w:t>JUSTIFICACI</w:t>
       </w:r>
       <w:r>
@@ -1063,15 +1139,7 @@
           <w:rFonts w:ascii="Arial" w:hAnsi="Arial" w:cs="Arial"/>
           <w:color w:val="0070C0"/>
         </w:rPr>
-        <w:t xml:space="preserve"> se puede mejorar la experiencia del usuario. También porque en este ciclo podremos ver como salirnos del </w:t>
-      </w:r>
-      <w:r>
-        <w:rPr>
-          <w:rFonts w:ascii="Arial" w:hAnsi="Arial" w:cs="Arial"/>
-          <w:color w:val="0070C0"/>
-        </w:rPr>
-        <w:lastRenderedPageBreak/>
-        <w:t xml:space="preserve">programa con el método </w:t>
+        <w:t xml:space="preserve"> se puede mejorar la experiencia del usuario. También porque en este ciclo podremos ver como salirnos del programa con el método </w:t>
       </w:r>
       <w:proofErr w:type="spellStart"/>
       <w:proofErr w:type="gramStart"/>
@@ -1123,6 +1191,8 @@
         <w:pStyle w:val="Prrafodelista"/>
         <w:rPr>
           <w:rFonts w:ascii="Arial" w:hAnsi="Arial" w:cs="Arial"/>
+          <w:b/>
+          <w:bCs/>
           <w:color w:val="0070C0"/>
         </w:rPr>
       </w:pPr>
@@ -1132,12 +1202,16 @@
         <w:pStyle w:val="Prrafodelista"/>
         <w:rPr>
           <w:rFonts w:ascii="Arial" w:hAnsi="Arial" w:cs="Arial"/>
-          <w:color w:val="0070C0"/>
-        </w:rPr>
-      </w:pPr>
-      <w:r>
-        <w:rPr>
-          <w:rFonts w:ascii="Arial" w:hAnsi="Arial" w:cs="Arial"/>
+          <w:b/>
+          <w:bCs/>
+          <w:color w:val="0070C0"/>
+        </w:rPr>
+      </w:pPr>
+      <w:r>
+        <w:rPr>
+          <w:rFonts w:ascii="Arial" w:hAnsi="Arial" w:cs="Arial"/>
+          <w:b/>
+          <w:bCs/>
           <w:color w:val="0070C0"/>
         </w:rPr>
         <w:t>METODOS AUXILIARES</w:t>
@@ -1224,9 +1298,18 @@
       <w:r>
         <w:rPr>
           <w:rFonts w:ascii="Arial" w:hAnsi="Arial" w:cs="Arial"/>
-          <w:color w:val="0070C0"/>
-        </w:rPr>
-        <w:t xml:space="preserve">JUSTIFICACION: Estas clases son necesarias para reutilizar líneas de código que se usan en varios métodos de la clase </w:t>
+          <w:b/>
+          <w:bCs/>
+          <w:color w:val="0070C0"/>
+        </w:rPr>
+        <w:t xml:space="preserve">JUSTIFICACION: </w:t>
+      </w:r>
+      <w:r>
+        <w:rPr>
+          <w:rFonts w:ascii="Arial" w:hAnsi="Arial" w:cs="Arial"/>
+          <w:color w:val="0070C0"/>
+        </w:rPr>
+        <w:t xml:space="preserve">Estas clases son necesarias para reutilizar líneas de código que se usan en varios métodos de la clase </w:t>
       </w:r>
       <w:proofErr w:type="spellStart"/>
       <w:r>
@@ -1288,11 +1371,58 @@
     </w:p>
     <w:p>
       <w:pPr>
-        <w:pStyle w:val="Prrafodelista"/>
-        <w:rPr>
-          <w:rFonts w:ascii="Arial" w:hAnsi="Arial" w:cs="Arial"/>
-        </w:rPr>
-      </w:pPr>
+        <w:ind w:left="708"/>
+        <w:rPr>
+          <w:rFonts w:ascii="Arial" w:hAnsi="Arial" w:cs="Arial"/>
+          <w:color w:val="0070C0"/>
+        </w:rPr>
+      </w:pPr>
+      <w:r>
+        <w:rPr>
+          <w:rFonts w:ascii="Arial" w:hAnsi="Arial" w:cs="Arial"/>
+          <w:b/>
+          <w:bCs/>
+          <w:color w:val="0070C0"/>
+        </w:rPr>
+        <w:t>R:</w:t>
+      </w:r>
+      <w:r>
+        <w:rPr>
+          <w:rFonts w:ascii="Arial" w:hAnsi="Arial" w:cs="Arial"/>
+          <w:color w:val="0070C0"/>
+        </w:rPr>
+        <w:t xml:space="preserve"> El estado actual del proyecto esta terminado, ya que los mini ciclos están completos incluyendo sus pruebas unitarias por cada uno. </w:t>
+      </w:r>
+      <w:r>
+        <w:rPr>
+          <w:rFonts w:ascii="Arial" w:hAnsi="Arial" w:cs="Arial"/>
+          <w:color w:val="0070C0"/>
+        </w:rPr>
+        <w:t xml:space="preserve">La ejecución de pruebas unitarias por cada </w:t>
+      </w:r>
+      <w:proofErr w:type="spellStart"/>
+      <w:r>
+        <w:rPr>
+          <w:rFonts w:ascii="Arial" w:hAnsi="Arial" w:cs="Arial"/>
+          <w:color w:val="0070C0"/>
+        </w:rPr>
+        <w:t>mini-ciclo</w:t>
+      </w:r>
+      <w:proofErr w:type="spellEnd"/>
+      <w:r>
+        <w:rPr>
+          <w:rFonts w:ascii="Arial" w:hAnsi="Arial" w:cs="Arial"/>
+          <w:color w:val="0070C0"/>
+        </w:rPr>
+        <w:t xml:space="preserve"> valida que cada módulo individual cumple con sus requerimientos funcionales sin errores aislados.</w:t>
+      </w:r>
+      <w:r>
+        <w:rPr>
+          <w:rFonts w:ascii="Arial" w:hAnsi="Arial" w:cs="Arial"/>
+          <w:color w:val="0070C0"/>
+        </w:rPr>
+        <w:t xml:space="preserve"> Además, la búsqueda de la completitud de los requerimientos solicitados para este primer ciclo.</w:t>
+      </w:r>
     </w:p>
     <w:p>
       <w:pPr>
@@ -1309,7 +1439,67 @@
         <w:rPr>
           <w:rFonts w:ascii="Arial" w:hAnsi="Arial" w:cs="Arial"/>
         </w:rPr>
-        <w:t>¿Cuál fue el tiempo total invertido por cada uno de ustedes? (Horas/Hombre)</w:t>
+        <w:t>¿Cuál fue el tiempo total invertido por cada uno de ustedes?</w:t>
+      </w:r>
+    </w:p>
+    <w:p>
+      <w:pPr>
+        <w:pStyle w:val="Prrafodelista"/>
+        <w:rPr>
+          <w:rFonts w:ascii="Arial" w:hAnsi="Arial" w:cs="Arial"/>
+          <w:b/>
+          <w:bCs/>
+          <w:color w:val="0070C0"/>
+        </w:rPr>
+      </w:pPr>
+      <w:r>
+        <w:rPr>
+          <w:rFonts w:ascii="Arial" w:hAnsi="Arial" w:cs="Arial"/>
+          <w:b/>
+          <w:bCs/>
+          <w:color w:val="0070C0"/>
+        </w:rPr>
+        <w:t xml:space="preserve">Elián </w:t>
+      </w:r>
+      <w:proofErr w:type="gramStart"/>
+      <w:r>
+        <w:rPr>
+          <w:rFonts w:ascii="Arial" w:hAnsi="Arial" w:cs="Arial"/>
+          <w:b/>
+          <w:bCs/>
+          <w:color w:val="0070C0"/>
+        </w:rPr>
+        <w:t>Ibarra :</w:t>
+      </w:r>
+      <w:proofErr w:type="gramEnd"/>
+      <w:r>
+        <w:rPr>
+          <w:rFonts w:ascii="Arial" w:hAnsi="Arial" w:cs="Arial"/>
+          <w:b/>
+          <w:bCs/>
+          <w:color w:val="0070C0"/>
+        </w:rPr>
+        <w:t xml:space="preserve"> 20 horas.</w:t>
+      </w:r>
+    </w:p>
+    <w:p>
+      <w:pPr>
+        <w:pStyle w:val="Prrafodelista"/>
+        <w:rPr>
+          <w:rFonts w:ascii="Arial" w:hAnsi="Arial" w:cs="Arial"/>
+          <w:b/>
+          <w:bCs/>
+          <w:color w:val="0070C0"/>
+        </w:rPr>
+      </w:pPr>
+      <w:r>
+        <w:rPr>
+          <w:rFonts w:ascii="Arial" w:hAnsi="Arial" w:cs="Arial"/>
+          <w:b/>
+          <w:bCs/>
+          <w:color w:val="0070C0"/>
+        </w:rPr>
+        <w:t>Oscar Poveda: 20 horas.</w:t>
       </w:r>
     </w:p>
     <w:p>
@@ -1343,6 +1533,42 @@
         <w:pStyle w:val="Prrafodelista"/>
         <w:rPr>
           <w:rFonts w:ascii="Arial" w:hAnsi="Arial" w:cs="Arial"/>
+          <w:color w:val="0070C0"/>
+        </w:rPr>
+      </w:pPr>
+      <w:r>
+        <w:rPr>
+          <w:rFonts w:ascii="Arial" w:hAnsi="Arial" w:cs="Arial"/>
+          <w:b/>
+          <w:bCs/>
+          <w:color w:val="0070C0"/>
+        </w:rPr>
+        <w:t>R</w:t>
+      </w:r>
+      <w:r>
+        <w:rPr>
+          <w:rFonts w:ascii="Arial" w:hAnsi="Arial" w:cs="Arial"/>
+          <w:b/>
+          <w:bCs/>
+          <w:color w:val="0070C0"/>
+        </w:rPr>
+        <w:t xml:space="preserve">: </w:t>
+      </w:r>
+      <w:r>
+        <w:rPr>
+          <w:rFonts w:ascii="Arial" w:hAnsi="Arial" w:cs="Arial"/>
+          <w:color w:val="0070C0"/>
+        </w:rPr>
+        <w:t>El mayor logro del equipo fue culminar el proyecto cumpliendo rigurosamente con todos los requerimientos solicitados por el cliente, ya que esto representaba nuestro objetivo principal; este proceso no solo garantizó una solución técnica efectiva, sino que nos permitió fortalecernos como equipo de trabajo en el ámbito académico y adquirir nuevos conocimientos individuales que enriquecen directamente nuestro perfil profesional.</w:t>
+      </w:r>
+    </w:p>
+    <w:p>
+      <w:pPr>
+        <w:pStyle w:val="Prrafodelista"/>
+        <w:rPr>
+          <w:rFonts w:ascii="Arial" w:hAnsi="Arial" w:cs="Arial"/>
+          <w:b/>
+          <w:bCs/>
         </w:rPr>
       </w:pPr>
     </w:p>
@@ -1369,8 +1595,51 @@
         <w:pStyle w:val="Prrafodelista"/>
         <w:rPr>
           <w:rFonts w:ascii="Arial" w:hAnsi="Arial" w:cs="Arial"/>
-        </w:rPr>
-      </w:pPr>
+          <w:color w:val="0070C0"/>
+        </w:rPr>
+      </w:pPr>
+      <w:r>
+        <w:rPr>
+          <w:rFonts w:ascii="Arial" w:hAnsi="Arial" w:cs="Arial"/>
+          <w:b/>
+          <w:bCs/>
+          <w:color w:val="0070C0"/>
+        </w:rPr>
+        <w:lastRenderedPageBreak/>
+        <w:t>R:</w:t>
+      </w:r>
+      <w:r>
+        <w:rPr>
+          <w:rFonts w:ascii="Arial" w:hAnsi="Arial" w:cs="Arial"/>
+          <w:color w:val="0070C0"/>
+        </w:rPr>
+        <w:t xml:space="preserve"> </w:t>
+      </w:r>
+      <w:r>
+        <w:rPr>
+          <w:rFonts w:ascii="Arial" w:hAnsi="Arial" w:cs="Arial"/>
+          <w:color w:val="0070C0"/>
+        </w:rPr>
+        <w:t xml:space="preserve">El mayor problema técnico fue el cálculo preciso y la ubicación de las formas dentro del </w:t>
+      </w:r>
+      <w:proofErr w:type="spellStart"/>
+      <w:r>
+        <w:rPr>
+          <w:rFonts w:ascii="Arial" w:hAnsi="Arial" w:cs="Arial"/>
+          <w:i/>
+          <w:iCs/>
+          <w:color w:val="0070C0"/>
+        </w:rPr>
+        <w:t>Canvas</w:t>
+      </w:r>
+      <w:proofErr w:type="spellEnd"/>
+      <w:r>
+        <w:rPr>
+          <w:rFonts w:ascii="Arial" w:hAnsi="Arial" w:cs="Arial"/>
+          <w:color w:val="0070C0"/>
+        </w:rPr>
+        <w:t xml:space="preserve"> según sus píxeles, lo cual resolvimos aplicando conceptos matemáticos básicos para comprender la dinámica de movimiento y posicionamiento de los objetos al generarse o modificarse en la interfaz gráfica.</w:t>
+      </w:r>
     </w:p>
     <w:p>
       <w:pPr>
@@ -1395,8 +1664,89 @@
         <w:pStyle w:val="Prrafodelista"/>
         <w:rPr>
           <w:rFonts w:ascii="Arial" w:hAnsi="Arial" w:cs="Arial"/>
-        </w:rPr>
-      </w:pPr>
+          <w:color w:val="0070C0"/>
+        </w:rPr>
+      </w:pPr>
+      <w:r>
+        <w:rPr>
+          <w:rFonts w:ascii="Arial" w:hAnsi="Arial" w:cs="Arial"/>
+          <w:b/>
+          <w:bCs/>
+          <w:color w:val="0070C0"/>
+        </w:rPr>
+        <w:t>R:</w:t>
+      </w:r>
+      <w:r>
+        <w:rPr>
+          <w:rFonts w:ascii="Arial" w:hAnsi="Arial" w:cs="Arial"/>
+          <w:color w:val="0070C0"/>
+        </w:rPr>
+        <w:t xml:space="preserve"> </w:t>
+      </w:r>
+      <w:r>
+        <w:rPr>
+          <w:rFonts w:ascii="Arial" w:hAnsi="Arial" w:cs="Arial"/>
+          <w:b/>
+          <w:bCs/>
+          <w:color w:val="0070C0"/>
+        </w:rPr>
+        <w:t>Lo que mejor hicimos como equipo:</w:t>
+      </w:r>
+      <w:r>
+        <w:rPr>
+          <w:rFonts w:ascii="Arial" w:hAnsi="Arial" w:cs="Arial"/>
+          <w:color w:val="0070C0"/>
+        </w:rPr>
+        <w:t xml:space="preserve"> Mantuvimos una comunicación constante basada en la revisión y discusión activa de ideas, demostrando un alto compromiso, empatía y el uso de nuestra creatividad y lógica para resolver los retos del desarrollo.</w:t>
+      </w:r>
+    </w:p>
+    <w:p>
+      <w:pPr>
+        <w:pStyle w:val="Prrafodelista"/>
+        <w:rPr>
+          <w:rFonts w:ascii="Arial" w:hAnsi="Arial" w:cs="Arial"/>
+          <w:color w:val="0070C0"/>
+        </w:rPr>
+      </w:pPr>
+    </w:p>
+    <w:p>
+      <w:pPr>
+        <w:pStyle w:val="Prrafodelista"/>
+        <w:rPr>
+          <w:rFonts w:ascii="Arial" w:hAnsi="Arial" w:cs="Arial"/>
+          <w:color w:val="0070C0"/>
+        </w:rPr>
+      </w:pPr>
+      <w:r>
+        <w:rPr>
+          <w:rFonts w:ascii="Arial" w:hAnsi="Arial" w:cs="Arial"/>
+          <w:b/>
+          <w:bCs/>
+          <w:color w:val="0070C0"/>
+        </w:rPr>
+        <w:t>Nuestro compromiso de mejora:</w:t>
+      </w:r>
+      <w:r>
+        <w:rPr>
+          <w:rFonts w:ascii="Arial" w:hAnsi="Arial" w:cs="Arial"/>
+          <w:color w:val="0070C0"/>
+        </w:rPr>
+        <w:t xml:space="preserve"> Nos comprometemos a optimizar la planificación inicial del proyecto para definir una estructura de desarrollo más clara, evitando así reprocesos y optimizando la gestión del tiempo en futuras entregas.</w:t>
+      </w:r>
+    </w:p>
+    <w:p>
+      <w:pPr>
+        <w:pStyle w:val="Prrafodelista"/>
+        <w:rPr>
+          <w:rFonts w:ascii="Arial" w:hAnsi="Arial" w:cs="Arial"/>
+        </w:rPr>
+      </w:pPr>
+      <w:r>
+        <w:rPr>
+          <w:rFonts w:ascii="Arial" w:hAnsi="Arial" w:cs="Arial"/>
+        </w:rPr>
+        <w:br/>
+      </w:r>
     </w:p>
     <w:p>
       <w:pPr>
@@ -1421,8 +1771,69 @@
         <w:pStyle w:val="Prrafodelista"/>
         <w:rPr>
           <w:rFonts w:ascii="Arial" w:hAnsi="Arial" w:cs="Arial"/>
-        </w:rPr>
-      </w:pPr>
+          <w:color w:val="0070C0"/>
+        </w:rPr>
+      </w:pPr>
+      <w:r>
+        <w:rPr>
+          <w:rFonts w:ascii="Arial" w:hAnsi="Arial" w:cs="Arial"/>
+          <w:b/>
+          <w:bCs/>
+          <w:color w:val="0070C0"/>
+        </w:rPr>
+        <w:t>R:</w:t>
+      </w:r>
+      <w:r>
+        <w:rPr>
+          <w:rFonts w:ascii="Arial" w:hAnsi="Arial" w:cs="Arial"/>
+          <w:color w:val="0070C0"/>
+        </w:rPr>
+        <w:t xml:space="preserve"> </w:t>
+      </w:r>
+      <w:r>
+        <w:rPr>
+          <w:rFonts w:ascii="Arial" w:hAnsi="Arial" w:cs="Arial"/>
+          <w:color w:val="0070C0"/>
+        </w:rPr>
+        <w:t xml:space="preserve">La práctica de XP más útil para nosotros fue el </w:t>
+      </w:r>
+      <w:r>
+        <w:rPr>
+          <w:rFonts w:ascii="Arial" w:hAnsi="Arial" w:cs="Arial"/>
+          <w:b/>
+          <w:bCs/>
+          <w:color w:val="0070C0"/>
+        </w:rPr>
+        <w:t>Diseño Simple</w:t>
+      </w:r>
+      <w:r>
+        <w:rPr>
+          <w:rFonts w:ascii="Arial" w:hAnsi="Arial" w:cs="Arial"/>
+          <w:color w:val="0070C0"/>
+        </w:rPr>
+        <w:t xml:space="preserve"> (o el modelado previo</w:t>
+      </w:r>
+      <w:r>
+        <w:rPr>
+          <w:rFonts w:ascii="Arial" w:hAnsi="Arial" w:cs="Arial"/>
+          <w:color w:val="0070C0"/>
+        </w:rPr>
+        <w:t xml:space="preserve"> con MDD</w:t>
+      </w:r>
+      <w:r>
+        <w:rPr>
+          <w:rFonts w:ascii="Arial" w:hAnsi="Arial" w:cs="Arial"/>
+          <w:color w:val="0070C0"/>
+        </w:rPr>
+        <w:t xml:space="preserve">), ya que nos permitió definir y visualizar la lógica de lo que íbamos a implementar antes de escribir el código. Esto facilitó la detección temprana de errores lógicos y simplificó la traducción de los requerimientos hacia la </w:t>
+      </w:r>
+      <w:r>
+        <w:rPr>
+          <w:rFonts w:ascii="Arial" w:hAnsi="Arial" w:cs="Arial"/>
+          <w:color w:val="0070C0"/>
+        </w:rPr>
+        <w:t>programación.</w:t>
+      </w:r>
     </w:p>
     <w:p>
       <w:pPr>
@@ -1445,20 +1856,18 @@
     <w:p>
       <w:pPr>
         <w:pStyle w:val="NormalWeb"/>
-        <w:ind w:left="709" w:hanging="709"/>
-        <w:rPr>
-          <w:rFonts w:ascii="Arial" w:hAnsi="Arial" w:cs="Arial"/>
-        </w:rPr>
-      </w:pPr>
-      <w:r>
-        <w:rPr>
-          <w:rFonts w:ascii="Arial" w:hAnsi="Arial" w:cs="Arial"/>
-        </w:rPr>
-        <w:tab/>
-      </w:r>
-      <w:r>
-        <w:rPr>
-          <w:rFonts w:ascii="Arial" w:hAnsi="Arial" w:cs="Arial"/>
+        <w:numPr>
+          <w:ilvl w:val="0"/>
+          <w:numId w:val="3"/>
+        </w:numPr>
+        <w:rPr>
+          <w:rFonts w:ascii="Arial" w:hAnsi="Arial" w:cs="Arial"/>
+        </w:rPr>
+      </w:pPr>
+      <w:r>
+        <w:rPr>
+          <w:rFonts w:ascii="Arial" w:hAnsi="Arial" w:cs="Arial"/>
+          <w:color w:val="0070C0"/>
           <w:lang w:val="en-US"/>
         </w:rPr>
         <w:t xml:space="preserve">Oracle. (2018). </w:t>
@@ -1468,6 +1877,7 @@
           <w:rFonts w:ascii="Arial" w:hAnsi="Arial" w:cs="Arial"/>
           <w:i/>
           <w:iCs/>
+          <w:color w:val="0070C0"/>
           <w:lang w:val="en-US"/>
         </w:rPr>
         <w:t xml:space="preserve">Class </w:t>
@@ -1478,6 +1888,7 @@
           <w:rFonts w:ascii="Arial" w:hAnsi="Arial" w:cs="Arial"/>
           <w:i/>
           <w:iCs/>
+          <w:color w:val="0070C0"/>
           <w:lang w:val="en-US"/>
         </w:rPr>
         <w:t>JPanel</w:t>
@@ -1488,6 +1899,7 @@
           <w:rFonts w:ascii="Arial" w:hAnsi="Arial" w:cs="Arial"/>
           <w:i/>
           <w:iCs/>
+          <w:color w:val="0070C0"/>
           <w:lang w:val="en-US"/>
         </w:rPr>
         <w:t xml:space="preserve"> (Java Platform SE 8)</w:t>
@@ -1495,6 +1907,7 @@
       <w:r>
         <w:rPr>
           <w:rFonts w:ascii="Arial" w:hAnsi="Arial" w:cs="Arial"/>
+          <w:color w:val="0070C0"/>
           <w:lang w:val="en-US"/>
         </w:rPr>
         <w:t xml:space="preserve">. </w:t>
@@ -1502,6 +1915,7 @@
       <w:r>
         <w:rPr>
           <w:rFonts w:ascii="Arial" w:hAnsi="Arial" w:cs="Arial"/>
+          <w:color w:val="0070C0"/>
         </w:rPr>
         <w:t xml:space="preserve">Oracle </w:t>
       </w:r>
@@ -1509,6 +1923,7 @@
       <w:r>
         <w:rPr>
           <w:rFonts w:ascii="Arial" w:hAnsi="Arial" w:cs="Arial"/>
+          <w:color w:val="0070C0"/>
         </w:rPr>
         <w:t>Documentation</w:t>
       </w:r>
@@ -1516,6 +1931,7 @@
       <w:r>
         <w:rPr>
           <w:rFonts w:ascii="Arial" w:hAnsi="Arial" w:cs="Arial"/>
+          <w:color w:val="0070C0"/>
         </w:rPr>
         <w:t xml:space="preserve">. </w:t>
       </w:r>
@@ -1538,22 +1954,20 @@
     <w:p>
       <w:pPr>
         <w:pStyle w:val="NormalWeb"/>
-        <w:ind w:left="709" w:hanging="709"/>
-        <w:rPr>
-          <w:rFonts w:ascii="Arial" w:hAnsi="Arial" w:cs="Arial"/>
-          <w:lang w:val="en-US"/>
-        </w:rPr>
-      </w:pPr>
-      <w:r>
-        <w:rPr>
-          <w:rFonts w:ascii="Arial" w:hAnsi="Arial" w:cs="Arial"/>
-        </w:rPr>
-        <w:tab/>
-      </w:r>
+        <w:numPr>
+          <w:ilvl w:val="0"/>
+          <w:numId w:val="3"/>
+        </w:numPr>
+        <w:rPr>
+          <w:rFonts w:ascii="Arial" w:hAnsi="Arial" w:cs="Arial"/>
+          <w:lang w:val="en-US"/>
+        </w:rPr>
+      </w:pPr>
       <w:proofErr w:type="spellStart"/>
       <w:r>
         <w:rPr>
           <w:rFonts w:ascii="Arial" w:hAnsi="Arial" w:cs="Arial"/>
+          <w:color w:val="0070C0"/>
           <w:lang w:val="en-US"/>
         </w:rPr>
         <w:t>Oregoom</w:t>
@@ -1562,6 +1976,7 @@
       <w:r>
         <w:rPr>
           <w:rFonts w:ascii="Arial" w:hAnsi="Arial" w:cs="Arial"/>
+          <w:color w:val="0070C0"/>
           <w:lang w:val="en-US"/>
         </w:rPr>
         <w:t xml:space="preserve">. (s. f.). </w:t>
@@ -1572,6 +1987,7 @@
           <w:rFonts w:ascii="Arial" w:hAnsi="Arial" w:cs="Arial"/>
           <w:i/>
           <w:iCs/>
+          <w:color w:val="0070C0"/>
           <w:lang w:val="en-US"/>
         </w:rPr>
         <w:t>JPanel</w:t>
@@ -1582,6 +1998,7 @@
           <w:rFonts w:ascii="Arial" w:hAnsi="Arial" w:cs="Arial"/>
           <w:i/>
           <w:iCs/>
+          <w:color w:val="0070C0"/>
           <w:lang w:val="en-US"/>
         </w:rPr>
         <w:t xml:space="preserve"> </w:t>
@@ -1592,6 +2009,7 @@
           <w:rFonts w:ascii="Arial" w:hAnsi="Arial" w:cs="Arial"/>
           <w:i/>
           <w:iCs/>
+          <w:color w:val="0070C0"/>
           <w:lang w:val="en-US"/>
         </w:rPr>
         <w:t>en</w:t>
@@ -1602,6 +2020,7 @@
           <w:rFonts w:ascii="Arial" w:hAnsi="Arial" w:cs="Arial"/>
           <w:i/>
           <w:iCs/>
+          <w:color w:val="0070C0"/>
           <w:lang w:val="en-US"/>
         </w:rPr>
         <w:t xml:space="preserve"> Java</w:t>
@@ -1609,6 +2028,7 @@
       <w:r>
         <w:rPr>
           <w:rFonts w:ascii="Arial" w:hAnsi="Arial" w:cs="Arial"/>
+          <w:color w:val="0070C0"/>
           <w:lang w:val="en-US"/>
         </w:rPr>
         <w:t xml:space="preserve">. </w:t>
@@ -1627,14 +2047,19 @@
     <w:p>
       <w:pPr>
         <w:pStyle w:val="NormalWeb"/>
-        <w:ind w:left="1417" w:hanging="709"/>
-        <w:rPr>
-          <w:rFonts w:ascii="Arial" w:hAnsi="Arial" w:cs="Arial"/>
-        </w:rPr>
-      </w:pPr>
-      <w:r>
-        <w:rPr>
-          <w:rFonts w:ascii="Arial" w:hAnsi="Arial" w:cs="Arial"/>
+        <w:numPr>
+          <w:ilvl w:val="0"/>
+          <w:numId w:val="3"/>
+        </w:numPr>
+        <w:rPr>
+          <w:rFonts w:ascii="Arial" w:hAnsi="Arial" w:cs="Arial"/>
+          <w:color w:val="0070C0"/>
+        </w:rPr>
+      </w:pPr>
+      <w:r>
+        <w:rPr>
+          <w:rFonts w:ascii="Arial" w:hAnsi="Arial" w:cs="Arial"/>
+          <w:color w:val="0070C0"/>
           <w:lang w:val="en-US"/>
         </w:rPr>
         <w:t xml:space="preserve">Oracle. (2018). </w:t>
@@ -1644,6 +2069,7 @@
           <w:rFonts w:ascii="Arial" w:hAnsi="Arial" w:cs="Arial"/>
           <w:i/>
           <w:iCs/>
+          <w:color w:val="0070C0"/>
           <w:lang w:val="en-US"/>
         </w:rPr>
         <w:t>Class HashSet (Java Platform SE 8)</w:t>
@@ -1651,6 +2077,7 @@
       <w:r>
         <w:rPr>
           <w:rFonts w:ascii="Arial" w:hAnsi="Arial" w:cs="Arial"/>
+          <w:color w:val="0070C0"/>
           <w:lang w:val="en-US"/>
         </w:rPr>
         <w:t xml:space="preserve">. </w:t>
@@ -1658,6 +2085,7 @@
       <w:r>
         <w:rPr>
           <w:rFonts w:ascii="Arial" w:hAnsi="Arial" w:cs="Arial"/>
+          <w:color w:val="0070C0"/>
         </w:rPr>
         <w:t xml:space="preserve">Oracle </w:t>
       </w:r>
@@ -1665,6 +2093,7 @@
       <w:r>
         <w:rPr>
           <w:rFonts w:ascii="Arial" w:hAnsi="Arial" w:cs="Arial"/>
+          <w:color w:val="0070C0"/>
         </w:rPr>
         <w:t>Documentation</w:t>
       </w:r>
@@ -1672,6 +2101,7 @@
       <w:r>
         <w:rPr>
           <w:rFonts w:ascii="Arial" w:hAnsi="Arial" w:cs="Arial"/>
+          <w:color w:val="0070C0"/>
         </w:rPr>
         <w:t xml:space="preserve">. </w:t>
       </w:r>
@@ -1688,14 +2118,18 @@
     <w:p>
       <w:pPr>
         <w:pStyle w:val="NormalWeb"/>
-        <w:ind w:left="1417" w:hanging="709"/>
-        <w:rPr>
-          <w:rFonts w:ascii="Arial" w:hAnsi="Arial" w:cs="Arial"/>
-        </w:rPr>
-      </w:pPr>
-      <w:r>
-        <w:rPr>
-          <w:rFonts w:ascii="Arial" w:hAnsi="Arial" w:cs="Arial"/>
+        <w:numPr>
+          <w:ilvl w:val="0"/>
+          <w:numId w:val="3"/>
+        </w:numPr>
+        <w:rPr>
+          <w:color w:val="0070C0"/>
+        </w:rPr>
+      </w:pPr>
+      <w:r>
+        <w:rPr>
+          <w:rFonts w:ascii="Arial" w:hAnsi="Arial" w:cs="Arial"/>
+          <w:color w:val="0070C0"/>
           <w:lang w:val="en-US"/>
         </w:rPr>
         <w:t xml:space="preserve">Oracle. (2018). </w:t>
@@ -1705,6 +2139,7 @@
           <w:rFonts w:ascii="Arial" w:hAnsi="Arial" w:cs="Arial"/>
           <w:i/>
           <w:iCs/>
+          <w:color w:val="0070C0"/>
           <w:lang w:val="en-US"/>
         </w:rPr>
         <w:t>Interface Set (Java Platform SE 8)</w:t>
@@ -1712,6 +2147,7 @@
       <w:r>
         <w:rPr>
           <w:rFonts w:ascii="Arial" w:hAnsi="Arial" w:cs="Arial"/>
+          <w:color w:val="0070C0"/>
           <w:lang w:val="en-US"/>
         </w:rPr>
         <w:t xml:space="preserve">. </w:t>
@@ -1719,6 +2155,7 @@
       <w:r>
         <w:rPr>
           <w:rFonts w:ascii="Arial" w:hAnsi="Arial" w:cs="Arial"/>
+          <w:color w:val="0070C0"/>
         </w:rPr>
         <w:t xml:space="preserve">Oracle </w:t>
       </w:r>
@@ -1726,6 +2163,7 @@
       <w:r>
         <w:rPr>
           <w:rFonts w:ascii="Arial" w:hAnsi="Arial" w:cs="Arial"/>
+          <w:color w:val="0070C0"/>
         </w:rPr>
         <w:t>Documentation</w:t>
       </w:r>
@@ -1733,6 +2171,7 @@
       <w:r>
         <w:rPr>
           <w:rFonts w:ascii="Arial" w:hAnsi="Arial" w:cs="Arial"/>
+          <w:color w:val="0070C0"/>
         </w:rPr>
         <w:t xml:space="preserve">. </w:t>
       </w:r>
@@ -1749,30 +2188,188 @@
     <w:p>
       <w:pPr>
         <w:pStyle w:val="NormalWeb"/>
+        <w:numPr>
+          <w:ilvl w:val="0"/>
+          <w:numId w:val="3"/>
+        </w:numPr>
+        <w:rPr>
+          <w:rFonts w:ascii="Arial" w:hAnsi="Arial" w:cs="Arial"/>
+          <w:color w:val="0070C0"/>
+        </w:rPr>
+      </w:pPr>
+      <w:proofErr w:type="spellStart"/>
+      <w:r>
+        <w:rPr>
+          <w:rFonts w:ascii="Arial" w:hAnsi="Arial" w:cs="Arial"/>
+          <w:color w:val="0070C0"/>
+        </w:rPr>
+        <w:t>Baeldung</w:t>
+      </w:r>
+      <w:proofErr w:type="spellEnd"/>
+      <w:r>
+        <w:rPr>
+          <w:rFonts w:ascii="Arial" w:hAnsi="Arial" w:cs="Arial"/>
+          <w:color w:val="0070C0"/>
+        </w:rPr>
+        <w:t xml:space="preserve">. (2024, 8 de mayo). </w:t>
+      </w:r>
+      <w:r>
+        <w:rPr>
+          <w:rFonts w:ascii="Arial" w:hAnsi="Arial" w:cs="Arial"/>
+          <w:i/>
+          <w:iCs/>
+          <w:color w:val="0070C0"/>
+        </w:rPr>
+        <w:t xml:space="preserve">A guide </w:t>
+      </w:r>
+      <w:proofErr w:type="spellStart"/>
+      <w:r>
+        <w:rPr>
+          <w:rFonts w:ascii="Arial" w:hAnsi="Arial" w:cs="Arial"/>
+          <w:i/>
+          <w:iCs/>
+          <w:color w:val="0070C0"/>
+        </w:rPr>
+        <w:t>to</w:t>
+      </w:r>
+      <w:proofErr w:type="spellEnd"/>
+      <w:r>
+        <w:rPr>
+          <w:rFonts w:ascii="Arial" w:hAnsi="Arial" w:cs="Arial"/>
+          <w:i/>
+          <w:iCs/>
+          <w:color w:val="0070C0"/>
+        </w:rPr>
+        <w:t xml:space="preserve"> </w:t>
+      </w:r>
+      <w:proofErr w:type="spellStart"/>
+      <w:r>
+        <w:rPr>
+          <w:rFonts w:ascii="Arial" w:hAnsi="Arial" w:cs="Arial"/>
+          <w:i/>
+          <w:iCs/>
+          <w:color w:val="0070C0"/>
+        </w:rPr>
+        <w:t>JUnit</w:t>
+      </w:r>
+      <w:proofErr w:type="spellEnd"/>
+      <w:r>
+        <w:rPr>
+          <w:rFonts w:ascii="Arial" w:hAnsi="Arial" w:cs="Arial"/>
+          <w:i/>
+          <w:iCs/>
+          <w:color w:val="0070C0"/>
+        </w:rPr>
+        <w:t xml:space="preserve"> 5</w:t>
+      </w:r>
+      <w:r>
+        <w:rPr>
+          <w:rFonts w:ascii="Arial" w:hAnsi="Arial" w:cs="Arial"/>
+          <w:color w:val="0070C0"/>
+        </w:rPr>
+        <w:t xml:space="preserve">. </w:t>
+      </w:r>
+      <w:hyperlink r:id="rId9" w:tgtFrame="_blank" w:history="1">
+        <w:r>
+          <w:rPr>
+            <w:rStyle w:val="Hipervnculo"/>
+            <w:rFonts w:ascii="Arial" w:hAnsi="Arial" w:cs="Arial"/>
+          </w:rPr>
+          <w:t>https://www.baeldung.com/junit-5</w:t>
+        </w:r>
+      </w:hyperlink>
+    </w:p>
+    <w:p>
+      <w:pPr>
+        <w:pStyle w:val="NormalWeb"/>
+        <w:numPr>
+          <w:ilvl w:val="0"/>
+          <w:numId w:val="3"/>
+        </w:numPr>
+        <w:rPr>
+          <w:rFonts w:ascii="Arial" w:hAnsi="Arial" w:cs="Arial"/>
+          <w:lang w:val="en-US"/>
+        </w:rPr>
+      </w:pPr>
+      <w:r>
+        <w:rPr>
+          <w:rFonts w:ascii="Arial" w:hAnsi="Arial" w:cs="Arial"/>
+          <w:color w:val="0070C0"/>
+        </w:rPr>
+        <w:t xml:space="preserve">Plynko, P. (2020, 5 de octubre). </w:t>
+      </w:r>
+      <w:proofErr w:type="spellStart"/>
+      <w:r>
+        <w:rPr>
+          <w:rFonts w:ascii="Arial" w:hAnsi="Arial" w:cs="Arial"/>
+          <w:i/>
+          <w:iCs/>
+          <w:color w:val="0070C0"/>
+        </w:rPr>
+        <w:t>Sistema.exit</w:t>
+      </w:r>
+      <w:proofErr w:type="spellEnd"/>
+      <w:r>
+        <w:rPr>
+          <w:rFonts w:ascii="Arial" w:hAnsi="Arial" w:cs="Arial"/>
+          <w:i/>
+          <w:iCs/>
+          <w:color w:val="0070C0"/>
+        </w:rPr>
+        <w:t>() en Java</w:t>
+      </w:r>
+      <w:r>
+        <w:rPr>
+          <w:rFonts w:ascii="Arial" w:hAnsi="Arial" w:cs="Arial"/>
+          <w:color w:val="0070C0"/>
+        </w:rPr>
+        <w:t xml:space="preserve">. </w:t>
+      </w:r>
+      <w:proofErr w:type="spellStart"/>
+      <w:r>
+        <w:rPr>
+          <w:rFonts w:ascii="Arial" w:hAnsi="Arial" w:cs="Arial"/>
+          <w:color w:val="0070C0"/>
+          <w:lang w:val="en-US"/>
+        </w:rPr>
+        <w:t>CodeGym</w:t>
+      </w:r>
+      <w:proofErr w:type="spellEnd"/>
+      <w:r>
+        <w:rPr>
+          <w:rFonts w:ascii="Arial" w:hAnsi="Arial" w:cs="Arial"/>
+          <w:color w:val="0070C0"/>
+          <w:lang w:val="en-US"/>
+        </w:rPr>
+        <w:t xml:space="preserve">. </w:t>
+      </w:r>
+      <w:hyperlink r:id="rId10" w:tgtFrame="_blank" w:history="1">
+        <w:r>
+          <w:rPr>
+            <w:rStyle w:val="Hipervnculo"/>
+            <w:rFonts w:ascii="Arial" w:hAnsi="Arial" w:cs="Arial"/>
+            <w:lang w:val="en-US"/>
+          </w:rPr>
+          <w:t>https://codegym.cc/es/groups/posts/es.384.sistema-exit-en-java</w:t>
+        </w:r>
+      </w:hyperlink>
+    </w:p>
+    <w:p>
+      <w:pPr>
+        <w:pStyle w:val="NormalWeb"/>
         <w:ind w:left="709" w:hanging="709"/>
         <w:rPr>
           <w:rFonts w:ascii="Arial" w:hAnsi="Arial" w:cs="Arial"/>
-        </w:rPr>
-      </w:pPr>
-    </w:p>
-    <w:p>
-      <w:pPr>
-        <w:rPr>
-          <w:rFonts w:ascii="Arial" w:hAnsi="Arial" w:cs="Arial"/>
-        </w:rPr>
-      </w:pPr>
-    </w:p>
-    <w:p>
-      <w:pPr>
-        <w:rPr>
-          <w:rFonts w:ascii="Arial" w:hAnsi="Arial" w:cs="Arial"/>
-        </w:rPr>
-      </w:pPr>
-      <w:r>
-        <w:rPr>
-          <w:rFonts w:ascii="Arial" w:hAnsi="Arial" w:cs="Arial"/>
-        </w:rPr>
-        <w:t xml:space="preserve"> </w:t>
+          <w:u w:val="single"/>
+          <w:lang w:val="en-US"/>
+        </w:rPr>
+      </w:pPr>
+      <w:r>
+        <w:rPr>
+          <w:rFonts w:ascii="Arial" w:hAnsi="Arial" w:cs="Arial"/>
+          <w:lang w:val="en-US"/>
+        </w:rPr>
+        <w:tab/>
       </w:r>
     </w:p>
     <w:sectPr>
@@ -1790,7 +2387,7 @@
   <w:abstractNum w:abstractNumId="0" w15:restartNumberingAfterBreak="0">
     <w:nsid w:val="45767147"/>
     <w:multiLevelType w:val="hybridMultilevel"/>
-    <w:tmpl w:val="48904638"/>
+    <w:tmpl w:val="897852FA"/>
     <w:lvl w:ilvl="0" w:tplc="240A000F">
       <w:start w:val="1"/>
       <w:numFmt w:val="decimal"/>
@@ -1877,6 +2474,207 @@
     </w:lvl>
   </w:abstractNum>
   <w:abstractNum w:abstractNumId="1" w15:restartNumberingAfterBreak="0">
+    <w:nsid w:val="45BF05ED"/>
+    <w:multiLevelType w:val="hybridMultilevel"/>
+    <w:tmpl w:val="63702B8C"/>
+    <w:lvl w:ilvl="0" w:tplc="C03C37AC">
+      <w:start w:val="2"/>
+      <w:numFmt w:val="bullet"/>
+      <w:lvlText w:val="-"/>
+      <w:lvlJc w:val="left"/>
+      <w:pPr>
+        <w:ind w:left="720" w:hanging="360"/>
+      </w:pPr>
+      <w:rPr>
+        <w:rFonts w:ascii="Aptos" w:eastAsiaTheme="minorHAnsi" w:hAnsi="Aptos" w:cstheme="minorBidi" w:hint="default"/>
+      </w:rPr>
+    </w:lvl>
+    <w:lvl w:ilvl="1" w:tplc="FFFFFFFF" w:tentative="1">
+      <w:start w:val="1"/>
+      <w:numFmt w:val="lowerLetter"/>
+      <w:lvlText w:val="%2."/>
+      <w:lvlJc w:val="left"/>
+      <w:pPr>
+        <w:ind w:left="1440" w:hanging="360"/>
+      </w:pPr>
+    </w:lvl>
+    <w:lvl w:ilvl="2" w:tplc="FFFFFFFF" w:tentative="1">
+      <w:start w:val="1"/>
+      <w:numFmt w:val="lowerRoman"/>
+      <w:lvlText w:val="%3."/>
+      <w:lvlJc w:val="right"/>
+      <w:pPr>
+        <w:ind w:left="2160" w:hanging="180"/>
+      </w:pPr>
+    </w:lvl>
+    <w:lvl w:ilvl="3" w:tplc="FFFFFFFF" w:tentative="1">
+      <w:start w:val="1"/>
+      <w:numFmt w:val="decimal"/>
+      <w:lvlText w:val="%4."/>
+      <w:lvlJc w:val="left"/>
+      <w:pPr>
+        <w:ind w:left="2880" w:hanging="360"/>
+      </w:pPr>
+    </w:lvl>
+    <w:lvl w:ilvl="4" w:tplc="FFFFFFFF" w:tentative="1">
+      <w:start w:val="1"/>
+      <w:numFmt w:val="lowerLetter"/>
+      <w:lvlText w:val="%5."/>
+      <w:lvlJc w:val="left"/>
+      <w:pPr>
+        <w:ind w:left="3600" w:hanging="360"/>
+      </w:pPr>
+    </w:lvl>
+    <w:lvl w:ilvl="5" w:tplc="FFFFFFFF" w:tentative="1">
+      <w:start w:val="1"/>
+      <w:numFmt w:val="lowerRoman"/>
+      <w:lvlText w:val="%6."/>
+      <w:lvlJc w:val="right"/>
+      <w:pPr>
+        <w:ind w:left="4320" w:hanging="180"/>
+      </w:pPr>
+    </w:lvl>
+    <w:lvl w:ilvl="6" w:tplc="FFFFFFFF" w:tentative="1">
+      <w:start w:val="1"/>
+      <w:numFmt w:val="decimal"/>
+      <w:lvlText w:val="%7."/>
+      <w:lvlJc w:val="left"/>
+      <w:pPr>
+        <w:ind w:left="5040" w:hanging="360"/>
+      </w:pPr>
+    </w:lvl>
+    <w:lvl w:ilvl="7" w:tplc="FFFFFFFF" w:tentative="1">
+      <w:start w:val="1"/>
+      <w:numFmt w:val="lowerLetter"/>
+      <w:lvlText w:val="%8."/>
+      <w:lvlJc w:val="left"/>
+      <w:pPr>
+        <w:ind w:left="5760" w:hanging="360"/>
+      </w:pPr>
+    </w:lvl>
+    <w:lvl w:ilvl="8" w:tplc="FFFFFFFF" w:tentative="1">
+      <w:start w:val="1"/>
+      <w:numFmt w:val="lowerRoman"/>
+      <w:lvlText w:val="%9."/>
+      <w:lvlJc w:val="right"/>
+      <w:pPr>
+        <w:ind w:left="6480" w:hanging="180"/>
+      </w:pPr>
+    </w:lvl>
+  </w:abstractNum>
+  <w:abstractNum w:abstractNumId="2" w15:restartNumberingAfterBreak="0">
+    <w:nsid w:val="47234E64"/>
+    <w:multiLevelType w:val="hybridMultilevel"/>
+    <w:tmpl w:val="99E8D4E0"/>
+    <w:lvl w:ilvl="0" w:tplc="5A6066EA">
+      <w:numFmt w:val="bullet"/>
+      <w:lvlText w:val="-"/>
+      <w:lvlJc w:val="left"/>
+      <w:pPr>
+        <w:ind w:left="720" w:hanging="360"/>
+      </w:pPr>
+      <w:rPr>
+        <w:rFonts w:ascii="Arial" w:eastAsiaTheme="minorHAnsi" w:hAnsi="Arial" w:cs="Arial" w:hint="default"/>
+      </w:rPr>
+    </w:lvl>
+    <w:lvl w:ilvl="1" w:tplc="240A0003" w:tentative="1">
+      <w:start w:val="1"/>
+      <w:numFmt w:val="bullet"/>
+      <w:lvlText w:val="o"/>
+      <w:lvlJc w:val="left"/>
+      <w:pPr>
+        <w:ind w:left="1440" w:hanging="360"/>
+      </w:pPr>
+      <w:rPr>
+        <w:rFonts w:ascii="Courier New" w:hAnsi="Courier New" w:cs="Courier New" w:hint="default"/>
+      </w:rPr>
+    </w:lvl>
+    <w:lvl w:ilvl="2" w:tplc="240A0005" w:tentative="1">
+      <w:start w:val="1"/>
+      <w:numFmt w:val="bullet"/>
+      <w:lvlText w:val=""/>
+      <w:lvlJc w:val="left"/>
+      <w:pPr>
+        <w:ind w:left="2160" w:hanging="360"/>
+      </w:pPr>
+      <w:rPr>
+        <w:rFonts w:ascii="Wingdings" w:hAnsi="Wingdings" w:hint="default"/>
+      </w:rPr>
+    </w:lvl>
+    <w:lvl w:ilvl="3" w:tplc="240A0001" w:tentative="1">
+      <w:start w:val="1"/>
+      <w:numFmt w:val="bullet"/>
+      <w:lvlText w:val=""/>
+      <w:lvlJc w:val="left"/>
+      <w:pPr>
+        <w:ind w:left="2880" w:hanging="360"/>
+      </w:pPr>
+      <w:rPr>
+        <w:rFonts w:ascii="Symbol" w:hAnsi="Symbol" w:hint="default"/>
+      </w:rPr>
+    </w:lvl>
+    <w:lvl w:ilvl="4" w:tplc="240A0003" w:tentative="1">
+      <w:start w:val="1"/>
+      <w:numFmt w:val="bullet"/>
+      <w:lvlText w:val="o"/>
+      <w:lvlJc w:val="left"/>
+      <w:pPr>
+        <w:ind w:left="3600" w:hanging="360"/>
+      </w:pPr>
+      <w:rPr>
+        <w:rFonts w:ascii="Courier New" w:hAnsi="Courier New" w:cs="Courier New" w:hint="default"/>
+      </w:rPr>
+    </w:lvl>
+    <w:lvl w:ilvl="5" w:tplc="240A0005" w:tentative="1">
+      <w:start w:val="1"/>
+      <w:numFmt w:val="bullet"/>
+      <w:lvlText w:val=""/>
+      <w:lvlJc w:val="left"/>
+      <w:pPr>
+        <w:ind w:left="4320" w:hanging="360"/>
+      </w:pPr>
+      <w:rPr>
+        <w:rFonts w:ascii="Wingdings" w:hAnsi="Wingdings" w:hint="default"/>
+      </w:rPr>
+    </w:lvl>
+    <w:lvl w:ilvl="6" w:tplc="240A0001" w:tentative="1">
+      <w:start w:val="1"/>
+      <w:numFmt w:val="bullet"/>
+      <w:lvlText w:val=""/>
+      <w:lvlJc w:val="left"/>
+      <w:pPr>
+        <w:ind w:left="5040" w:hanging="360"/>
+      </w:pPr>
+      <w:rPr>
+        <w:rFonts w:ascii="Symbol" w:hAnsi="Symbol" w:hint="default"/>
+      </w:rPr>
+    </w:lvl>
+    <w:lvl w:ilvl="7" w:tplc="240A0003" w:tentative="1">
+      <w:start w:val="1"/>
+      <w:numFmt w:val="bullet"/>
+      <w:lvlText w:val="o"/>
+      <w:lvlJc w:val="left"/>
+      <w:pPr>
+        <w:ind w:left="5760" w:hanging="360"/>
+      </w:pPr>
+      <w:rPr>
+        <w:rFonts w:ascii="Courier New" w:hAnsi="Courier New" w:cs="Courier New" w:hint="default"/>
+      </w:rPr>
+    </w:lvl>
+    <w:lvl w:ilvl="8" w:tplc="240A0005" w:tentative="1">
+      <w:start w:val="1"/>
+      <w:numFmt w:val="bullet"/>
+      <w:lvlText w:val=""/>
+      <w:lvlJc w:val="left"/>
+      <w:pPr>
+        <w:ind w:left="6480" w:hanging="360"/>
+      </w:pPr>
+      <w:rPr>
+        <w:rFonts w:ascii="Wingdings" w:hAnsi="Wingdings" w:hint="default"/>
+      </w:rPr>
+    </w:lvl>
+  </w:abstractNum>
+  <w:abstractNum w:abstractNumId="3" w15:restartNumberingAfterBreak="0">
     <w:nsid w:val="573E3746"/>
     <w:multiLevelType w:val="hybridMultilevel"/>
     <w:tmpl w:val="4888E85C"/>
@@ -1993,7 +2791,13 @@
     <w:abstractNumId w:val="0"/>
   </w:num>
   <w:num w:numId="2" w16cid:durableId="547227165">
+    <w:abstractNumId w:val="3"/>
+  </w:num>
+  <w:num w:numId="3" w16cid:durableId="387074931">
     <w:abstractNumId w:val="1"/>
+  </w:num>
+  <w:num w:numId="4" w16cid:durableId="98375365">
+    <w:abstractNumId w:val="2"/>
   </w:num>
 </w:numbering>
 </file>
@@ -2918,7 +3722,6 @@
     <w:name w:val="Normal (Web)"/>
     <w:basedOn w:val="Normal"/>
     <w:uiPriority w:val="99"/>
-    <w:semiHidden/>
     <w:unhideWhenUsed/>
     <w:rsid w:val="000F5F15"/>
     <w:pPr>

</xml_diff>